<commit_message>
added manual de usuario
</commit_message>
<xml_diff>
--- a/Manual de Usuario.docx
+++ b/Manual de Usuario.docx
@@ -30,7 +30,7 @@
                     </pic:cNvPicPr>
                   </pic:nvPicPr>
                   <pic:blipFill>
-                    <a:blip r:embed="rId4" cstate="print">
+                    <a:blip r:embed="rId5" cstate="print">
                       <a:extLst>
                         <a:ext uri="{28A0092B-C50C-407E-A947-70E740481C1C}">
                           <a14:useLocalDpi xmlns:a14="http://schemas.microsoft.com/office/drawing/2010/main" val="0"/>
@@ -89,7 +89,7 @@
                     </pic:cNvPicPr>
                   </pic:nvPicPr>
                   <pic:blipFill>
-                    <a:blip r:embed="rId5" cstate="print">
+                    <a:blip r:embed="rId6" cstate="print">
                       <a:extLst>
                         <a:ext uri="{28A0092B-C50C-407E-A947-70E740481C1C}">
                           <a14:useLocalDpi xmlns:a14="http://schemas.microsoft.com/office/drawing/2010/main" val="0"/>
@@ -464,6 +464,1438 @@
           <w:lang w:val="es-MX"/>
         </w:rPr>
       </w:pPr>
+      <w:r>
+        <w:rPr>
+          <w:b/>
+          <w:bCs/>
+          <w:sz w:val="28"/>
+          <w:szCs w:val="28"/>
+          <w:lang w:val="es-MX"/>
+        </w:rPr>
+        <w:lastRenderedPageBreak/>
+        <w:drawing>
+          <wp:anchor distT="0" distB="0" distL="114300" distR="114300" simplePos="0" relativeHeight="251658240" behindDoc="0" locked="0" layoutInCell="1" allowOverlap="1" wp14:anchorId="1C21FC05" wp14:editId="4342424D">
+            <wp:simplePos x="0" y="0"/>
+            <wp:positionH relativeFrom="column">
+              <wp:posOffset>0</wp:posOffset>
+            </wp:positionH>
+            <wp:positionV relativeFrom="paragraph">
+              <wp:posOffset>335280</wp:posOffset>
+            </wp:positionV>
+            <wp:extent cx="1005840" cy="2426335"/>
+            <wp:effectExtent l="0" t="0" r="3810" b="0"/>
+            <wp:wrapSquare wrapText="bothSides"/>
+            <wp:docPr id="1885689886" name="Picture 1"/>
+            <wp:cNvGraphicFramePr>
+              <a:graphicFrameLocks xmlns:a="http://schemas.openxmlformats.org/drawingml/2006/main" noChangeAspect="1"/>
+            </wp:cNvGraphicFramePr>
+            <a:graphic xmlns:a="http://schemas.openxmlformats.org/drawingml/2006/main">
+              <a:graphicData uri="http://schemas.openxmlformats.org/drawingml/2006/picture">
+                <pic:pic xmlns:pic="http://schemas.openxmlformats.org/drawingml/2006/picture">
+                  <pic:nvPicPr>
+                    <pic:cNvPr id="1885689886" name=""/>
+                    <pic:cNvPicPr/>
+                  </pic:nvPicPr>
+                  <pic:blipFill>
+                    <a:blip r:embed="rId7">
+                      <a:extLst>
+                        <a:ext uri="{28A0092B-C50C-407E-A947-70E740481C1C}">
+                          <a14:useLocalDpi xmlns:a14="http://schemas.microsoft.com/office/drawing/2010/main" val="0"/>
+                        </a:ext>
+                      </a:extLst>
+                    </a:blip>
+                    <a:stretch>
+                      <a:fillRect/>
+                    </a:stretch>
+                  </pic:blipFill>
+                  <pic:spPr>
+                    <a:xfrm>
+                      <a:off x="0" y="0"/>
+                      <a:ext cx="1005840" cy="2426335"/>
+                    </a:xfrm>
+                    <a:prstGeom prst="rect">
+                      <a:avLst/>
+                    </a:prstGeom>
+                  </pic:spPr>
+                </pic:pic>
+              </a:graphicData>
+            </a:graphic>
+            <wp14:sizeRelH relativeFrom="margin">
+              <wp14:pctWidth>0</wp14:pctWidth>
+            </wp14:sizeRelH>
+            <wp14:sizeRelV relativeFrom="margin">
+              <wp14:pctHeight>0</wp14:pctHeight>
+            </wp14:sizeRelV>
+          </wp:anchor>
+        </w:drawing>
+      </w:r>
+      <w:r>
+        <w:rPr>
+          <w:b/>
+          <w:bCs/>
+          <w:sz w:val="28"/>
+          <w:szCs w:val="28"/>
+          <w:lang w:val="es-MX"/>
+        </w:rPr>
+        <w:t xml:space="preserve">Formato de archivo importable </w:t>
+      </w:r>
+      <w:r>
+        <w:rPr>
+          <w:b/>
+          <w:bCs/>
+          <w:sz w:val="28"/>
+          <w:szCs w:val="28"/>
+          <w:lang w:val="es-MX"/>
+        </w:rPr>
+        <w:t>GrafoVuelos</w:t>
+      </w:r>
+      <w:r>
+        <w:rPr>
+          <w:b/>
+          <w:bCs/>
+          <w:sz w:val="28"/>
+          <w:szCs w:val="28"/>
+          <w:lang w:val="es-MX"/>
+        </w:rPr>
+        <w:t>.txt</w:t>
+      </w:r>
+    </w:p>
+    <w:p>
+      <w:pPr>
+        <w:rPr>
+          <w:sz w:val="24"/>
+          <w:szCs w:val="24"/>
+          <w:lang w:val="es-MX"/>
+        </w:rPr>
+      </w:pPr>
+      <w:r>
+        <w:rPr>
+          <w:sz w:val="24"/>
+          <w:szCs w:val="24"/>
+          <w:lang w:val="es-MX"/>
+        </w:rPr>
+        <w:t>El primer valor esperado del archivo importable es la cantidad total de destinos.</w:t>
+      </w:r>
+    </w:p>
+    <w:p>
+      <w:pPr>
+        <w:rPr>
+          <w:sz w:val="24"/>
+          <w:szCs w:val="24"/>
+          <w:lang w:val="es-MX"/>
+        </w:rPr>
+      </w:pPr>
+      <w:r>
+        <w:rPr>
+          <w:sz w:val="24"/>
+          <w:szCs w:val="24"/>
+          <w:lang w:val="es-MX"/>
+        </w:rPr>
+        <w:t>Después</w:t>
+      </w:r>
+      <w:r>
+        <w:rPr>
+          <w:sz w:val="24"/>
+          <w:szCs w:val="24"/>
+          <w:lang w:val="es-MX"/>
+        </w:rPr>
+        <w:t>, se habrá que ingresar el tiempo de vuelo y costos correspondientes de cada destino de la siguiente manera:</w:t>
+      </w:r>
+    </w:p>
+    <w:p>
+      <w:pPr>
+        <w:rPr>
+          <w:sz w:val="24"/>
+          <w:szCs w:val="24"/>
+          <w:lang w:val="es-MX"/>
+        </w:rPr>
+      </w:pPr>
+      <w:r>
+        <w:rPr>
+          <w:sz w:val="24"/>
+          <w:szCs w:val="24"/>
+          <w:lang w:val="es-MX"/>
+        </w:rPr>
+        <w:t>{</w:t>
+      </w:r>
+    </w:p>
+    <w:p>
+      <w:pPr>
+        <w:rPr>
+          <w:sz w:val="24"/>
+          <w:szCs w:val="24"/>
+          <w:lang w:val="es-MX"/>
+        </w:rPr>
+      </w:pPr>
+      <w:r>
+        <w:rPr>
+          <w:sz w:val="24"/>
+          <w:szCs w:val="24"/>
+          <w:lang w:val="es-MX"/>
+        </w:rPr>
+        <w:t>Tiempo_destino1, Costo_destino1</w:t>
+      </w:r>
+    </w:p>
+    <w:p>
+      <w:pPr>
+        <w:rPr>
+          <w:sz w:val="24"/>
+          <w:szCs w:val="24"/>
+          <w:lang w:val="es-MX"/>
+        </w:rPr>
+      </w:pPr>
+      <w:r>
+        <w:rPr>
+          <w:sz w:val="24"/>
+          <w:szCs w:val="24"/>
+          <w:lang w:val="es-MX"/>
+        </w:rPr>
+        <w:t>Tiempo_destino</w:t>
+      </w:r>
+      <w:r>
+        <w:rPr>
+          <w:sz w:val="24"/>
+          <w:szCs w:val="24"/>
+          <w:lang w:val="es-MX"/>
+        </w:rPr>
+        <w:t>2,</w:t>
+      </w:r>
+      <w:r>
+        <w:rPr>
+          <w:sz w:val="24"/>
+          <w:szCs w:val="24"/>
+          <w:lang w:val="es-MX"/>
+        </w:rPr>
+        <w:t xml:space="preserve"> Costo_destino</w:t>
+      </w:r>
+      <w:r>
+        <w:rPr>
+          <w:sz w:val="24"/>
+          <w:szCs w:val="24"/>
+          <w:lang w:val="es-MX"/>
+        </w:rPr>
+        <w:t>2</w:t>
+      </w:r>
+    </w:p>
+    <w:p>
+      <w:pPr>
+        <w:rPr>
+          <w:sz w:val="24"/>
+          <w:szCs w:val="24"/>
+          <w:lang w:val="es-MX"/>
+        </w:rPr>
+      </w:pPr>
+      <w:r>
+        <w:rPr>
+          <w:sz w:val="24"/>
+          <w:szCs w:val="24"/>
+          <w:lang w:val="es-MX"/>
+        </w:rPr>
+        <w:t>…</w:t>
+      </w:r>
+    </w:p>
+    <w:p>
+      <w:pPr>
+        <w:rPr>
+          <w:sz w:val="24"/>
+          <w:szCs w:val="24"/>
+          <w:lang w:val="es-MX"/>
+        </w:rPr>
+      </w:pPr>
+      <w:r>
+        <w:rPr>
+          <w:sz w:val="24"/>
+          <w:szCs w:val="24"/>
+          <w:lang w:val="es-MX"/>
+        </w:rPr>
+        <w:t>}</w:t>
+      </w:r>
+    </w:p>
+    <w:p>
+      <w:pPr>
+        <w:rPr>
+          <w:sz w:val="24"/>
+          <w:szCs w:val="24"/>
+          <w:lang w:val="es-MX"/>
+        </w:rPr>
+      </w:pPr>
+      <w:r>
+        <w:rPr>
+          <w:sz w:val="24"/>
+          <w:szCs w:val="24"/>
+          <w:lang w:val="es-MX"/>
+        </w:rPr>
+        <w:t xml:space="preserve">Donde cada conjunto de llaves {} representa un destino, por lo que el primer conjunto de </w:t>
+      </w:r>
+      <w:r>
+        <w:rPr>
+          <w:sz w:val="24"/>
+          <w:szCs w:val="24"/>
+          <w:lang w:val="es-MX"/>
+        </w:rPr>
+        <w:t>llaves</w:t>
+      </w:r>
+      <w:r>
+        <w:rPr>
+          <w:sz w:val="24"/>
+          <w:szCs w:val="24"/>
+          <w:lang w:val="es-MX"/>
+        </w:rPr>
+        <w:t xml:space="preserve"> representa al destino1 y cada uno de los valores dentro de las llaves, corresponderá al tiempo y costo que toma ir del destino1 a los demás destinos.</w:t>
+      </w:r>
+    </w:p>
+    <w:p>
+      <w:pPr>
+        <w:rPr>
+          <w:sz w:val="24"/>
+          <w:szCs w:val="24"/>
+          <w:lang w:val="es-MX"/>
+        </w:rPr>
+      </w:pPr>
+      <w:r>
+        <w:rPr>
+          <w:sz w:val="24"/>
+          <w:szCs w:val="24"/>
+          <w:lang w:val="es-MX"/>
+        </w:rPr>
+        <w:t>Por último, habrá que ingresar las etiquetas correspondientes a los destinos, de manera que el programa pueda identificarlos correctamente.</w:t>
+      </w:r>
+    </w:p>
+    <w:p>
+      <w:pPr>
+        <w:rPr>
+          <w:sz w:val="24"/>
+          <w:szCs w:val="24"/>
+          <w:lang w:val="es-MX"/>
+        </w:rPr>
+      </w:pPr>
+    </w:p>
+    <w:p>
+      <w:pPr>
+        <w:rPr>
+          <w:b/>
+          <w:bCs/>
+          <w:sz w:val="28"/>
+          <w:szCs w:val="28"/>
+          <w:lang w:val="es-MX"/>
+        </w:rPr>
+      </w:pPr>
+      <w:r>
+        <w:rPr>
+          <w:b/>
+          <w:bCs/>
+          <w:sz w:val="28"/>
+          <w:szCs w:val="28"/>
+          <w:lang w:val="es-MX"/>
+        </w:rPr>
+        <w:t>Ejecución</w:t>
+      </w:r>
+      <w:r>
+        <w:rPr>
+          <w:b/>
+          <w:bCs/>
+          <w:sz w:val="28"/>
+          <w:szCs w:val="28"/>
+          <w:lang w:val="es-MX"/>
+        </w:rPr>
+        <w:t xml:space="preserve"> del programa</w:t>
+      </w:r>
+    </w:p>
+    <w:p>
+      <w:pPr>
+        <w:rPr>
+          <w:sz w:val="24"/>
+          <w:szCs w:val="24"/>
+          <w:lang w:val="es-MX"/>
+        </w:rPr>
+      </w:pPr>
+      <w:r>
+        <w:rPr>
+          <w:sz w:val="24"/>
+          <w:szCs w:val="24"/>
+          <w:lang w:val="es-MX"/>
+        </w:rPr>
+        <w:t xml:space="preserve">Para poder ejecutar el programa, </w:t>
+      </w:r>
+      <w:r>
+        <w:rPr>
+          <w:sz w:val="24"/>
+          <w:szCs w:val="24"/>
+          <w:lang w:val="es-MX"/>
+        </w:rPr>
+        <w:t xml:space="preserve">solamente habrá que abrir el archivo llamado programa.exe ubicado en la carpeta bin. </w:t>
+      </w:r>
+    </w:p>
+    <w:p>
+      <w:pPr>
+        <w:rPr>
+          <w:sz w:val="24"/>
+          <w:szCs w:val="24"/>
+          <w:lang w:val="es-MX"/>
+        </w:rPr>
+      </w:pPr>
+      <w:r>
+        <w:rPr>
+          <w:sz w:val="24"/>
+          <w:szCs w:val="24"/>
+          <w:lang w:val="es-MX"/>
+        </w:rPr>
+        <w:t xml:space="preserve">En caso de necesitar una recompilacion debido a alguna modificación del código fuente, será necesario utilizar un compilador de C, el cual tendrá que compilar todos los archivos .c y .h ubicados dentro de la carpeta src. </w:t>
+      </w:r>
+    </w:p>
+    <w:p>
+      <w:pPr>
+        <w:rPr>
+          <w:sz w:val="24"/>
+          <w:szCs w:val="24"/>
+          <w:lang w:val="es-MX"/>
+        </w:rPr>
+      </w:pPr>
+      <w:r>
+        <w:rPr>
+          <w:sz w:val="24"/>
+          <w:szCs w:val="24"/>
+          <w:lang w:val="es-MX"/>
+        </w:rPr>
+        <w:t xml:space="preserve">Para mayor facilidad del usuario, creamos un archivo .bat que puede ser ejecutado que automatizará la compilación del programa mediante el uso de GCC, por lo </w:t>
+      </w:r>
+      <w:r>
+        <w:rPr>
+          <w:sz w:val="24"/>
+          <w:szCs w:val="24"/>
+          <w:lang w:val="es-MX"/>
+        </w:rPr>
+        <w:t>que,</w:t>
+      </w:r>
+      <w:r>
+        <w:rPr>
+          <w:sz w:val="24"/>
+          <w:szCs w:val="24"/>
+          <w:lang w:val="es-MX"/>
+        </w:rPr>
+        <w:t xml:space="preserve"> si no se cuenta con este compilador, será necesario descargarlo.</w:t>
+      </w:r>
+    </w:p>
+    <w:p>
+      <w:pPr>
+        <w:rPr>
+          <w:sz w:val="24"/>
+          <w:szCs w:val="24"/>
+          <w:lang w:val="es-MX"/>
+        </w:rPr>
+      </w:pPr>
+    </w:p>
+    <w:p>
+      <w:pPr>
+        <w:rPr>
+          <w:sz w:val="24"/>
+          <w:szCs w:val="24"/>
+          <w:lang w:val="es-MX"/>
+        </w:rPr>
+      </w:pPr>
+    </w:p>
+    <w:p>
+      <w:pPr>
+        <w:rPr>
+          <w:sz w:val="24"/>
+          <w:szCs w:val="24"/>
+          <w:lang w:val="es-MX"/>
+        </w:rPr>
+      </w:pPr>
+    </w:p>
+    <w:p>
+      <w:pPr>
+        <w:rPr>
+          <w:sz w:val="24"/>
+          <w:szCs w:val="24"/>
+          <w:lang w:val="es-MX"/>
+        </w:rPr>
+      </w:pPr>
+    </w:p>
+    <w:p>
+      <w:pPr>
+        <w:rPr>
+          <w:sz w:val="24"/>
+          <w:szCs w:val="24"/>
+          <w:lang w:val="es-MX"/>
+        </w:rPr>
+      </w:pPr>
+    </w:p>
+    <w:p>
+      <w:pPr>
+        <w:rPr>
+          <w:b/>
+          <w:bCs/>
+          <w:sz w:val="28"/>
+          <w:szCs w:val="28"/>
+          <w:lang w:val="es-MX"/>
+        </w:rPr>
+      </w:pPr>
+      <w:r>
+        <w:rPr>
+          <w:b/>
+          <w:bCs/>
+          <w:sz w:val="28"/>
+          <w:szCs w:val="28"/>
+          <w:lang w:val="es-MX"/>
+        </w:rPr>
+        <w:lastRenderedPageBreak/>
+        <w:t>Interfaz</w:t>
+      </w:r>
+    </w:p>
+    <w:p>
+      <w:pPr>
+        <w:rPr>
+          <w:sz w:val="24"/>
+          <w:szCs w:val="24"/>
+          <w:lang w:val="es-MX"/>
+        </w:rPr>
+      </w:pPr>
+      <w:r>
+        <w:rPr>
+          <w:b/>
+          <w:bCs/>
+          <w:sz w:val="24"/>
+          <w:szCs w:val="24"/>
+          <w:lang w:val="es-MX"/>
+        </w:rPr>
+        <w:drawing>
+          <wp:anchor distT="0" distB="0" distL="114300" distR="114300" simplePos="0" relativeHeight="251659264" behindDoc="0" locked="0" layoutInCell="1" allowOverlap="1" wp14:anchorId="7B9F21F3" wp14:editId="464363D3">
+            <wp:simplePos x="0" y="0"/>
+            <wp:positionH relativeFrom="column">
+              <wp:posOffset>0</wp:posOffset>
+            </wp:positionH>
+            <wp:positionV relativeFrom="paragraph">
+              <wp:posOffset>-635</wp:posOffset>
+            </wp:positionV>
+            <wp:extent cx="2442622" cy="1356360"/>
+            <wp:effectExtent l="0" t="0" r="0" b="0"/>
+            <wp:wrapSquare wrapText="bothSides"/>
+            <wp:docPr id="356866959" name="Picture 1"/>
+            <wp:cNvGraphicFramePr>
+              <a:graphicFrameLocks xmlns:a="http://schemas.openxmlformats.org/drawingml/2006/main" noChangeAspect="1"/>
+            </wp:cNvGraphicFramePr>
+            <a:graphic xmlns:a="http://schemas.openxmlformats.org/drawingml/2006/main">
+              <a:graphicData uri="http://schemas.openxmlformats.org/drawingml/2006/picture">
+                <pic:pic xmlns:pic="http://schemas.openxmlformats.org/drawingml/2006/picture">
+                  <pic:nvPicPr>
+                    <pic:cNvPr id="356866959" name=""/>
+                    <pic:cNvPicPr/>
+                  </pic:nvPicPr>
+                  <pic:blipFill>
+                    <a:blip r:embed="rId8">
+                      <a:extLst>
+                        <a:ext uri="{28A0092B-C50C-407E-A947-70E740481C1C}">
+                          <a14:useLocalDpi xmlns:a14="http://schemas.microsoft.com/office/drawing/2010/main" val="0"/>
+                        </a:ext>
+                      </a:extLst>
+                    </a:blip>
+                    <a:stretch>
+                      <a:fillRect/>
+                    </a:stretch>
+                  </pic:blipFill>
+                  <pic:spPr>
+                    <a:xfrm>
+                      <a:off x="0" y="0"/>
+                      <a:ext cx="2442622" cy="1356360"/>
+                    </a:xfrm>
+                    <a:prstGeom prst="rect">
+                      <a:avLst/>
+                    </a:prstGeom>
+                  </pic:spPr>
+                </pic:pic>
+              </a:graphicData>
+            </a:graphic>
+          </wp:anchor>
+        </w:drawing>
+      </w:r>
+      <w:r>
+        <w:rPr>
+          <w:sz w:val="24"/>
+          <w:szCs w:val="24"/>
+          <w:lang w:val="es-MX"/>
+        </w:rPr>
+        <w:t xml:space="preserve">Al abrir el programa, se </w:t>
+      </w:r>
+      <w:r>
+        <w:rPr>
+          <w:sz w:val="24"/>
+          <w:szCs w:val="24"/>
+          <w:lang w:val="es-MX"/>
+        </w:rPr>
+        <w:t>mostrará</w:t>
+      </w:r>
+      <w:r>
+        <w:rPr>
+          <w:sz w:val="24"/>
+          <w:szCs w:val="24"/>
+          <w:lang w:val="es-MX"/>
+        </w:rPr>
+        <w:t xml:space="preserve"> el menú de la fotografía de lado izquierdo. De encontrarse un error en la carga del grafo, habrá que revisar el archivo .txt en la carpeta src, ya que lo mas probable es que no se hayan ingresado correctamente la información.</w:t>
+      </w:r>
+    </w:p>
+    <w:p>
+      <w:pPr>
+        <w:rPr>
+          <w:sz w:val="24"/>
+          <w:szCs w:val="24"/>
+          <w:lang w:val="es-MX"/>
+        </w:rPr>
+      </w:pPr>
+    </w:p>
+    <w:p>
+      <w:pPr>
+        <w:rPr>
+          <w:sz w:val="24"/>
+          <w:szCs w:val="24"/>
+          <w:lang w:val="es-MX"/>
+        </w:rPr>
+      </w:pPr>
+      <w:r>
+        <w:rPr>
+          <w:sz w:val="24"/>
+          <w:szCs w:val="24"/>
+          <w:lang w:val="es-MX"/>
+        </w:rPr>
+        <w:t>Existe la posibilidad de que exista un error generado debido a problemas con la apertura de archivos del programa, aunque poco probable, en caso de ocurrir, contactar con algún administrador del programa para obtener apoyo técnico para poder resolverlo.</w:t>
+      </w:r>
+    </w:p>
+    <w:p>
+      <w:pPr>
+        <w:rPr>
+          <w:sz w:val="24"/>
+          <w:szCs w:val="24"/>
+          <w:lang w:val="es-MX"/>
+        </w:rPr>
+      </w:pPr>
+    </w:p>
+    <w:p>
+      <w:pPr>
+        <w:rPr>
+          <w:b/>
+          <w:bCs/>
+          <w:sz w:val="28"/>
+          <w:szCs w:val="28"/>
+          <w:lang w:val="es-MX"/>
+        </w:rPr>
+      </w:pPr>
+      <w:r>
+        <w:rPr>
+          <w:b/>
+          <w:bCs/>
+          <w:sz w:val="28"/>
+          <w:szCs w:val="28"/>
+          <w:lang w:val="es-MX"/>
+        </w:rPr>
+        <w:t>Opciones</w:t>
+      </w:r>
+    </w:p>
+    <w:p>
+      <w:pPr>
+        <w:pStyle w:val="ListParagraph"/>
+        <w:numPr>
+          <w:ilvl w:val="0"/>
+          <w:numId w:val="1"/>
+        </w:numPr>
+        <w:rPr>
+          <w:b/>
+          <w:bCs/>
+          <w:sz w:val="24"/>
+          <w:szCs w:val="24"/>
+          <w:lang w:val="es-MX"/>
+        </w:rPr>
+      </w:pPr>
+      <w:r>
+        <w:rPr>
+          <w:b/>
+          <w:bCs/>
+          <w:sz w:val="24"/>
+          <w:szCs w:val="24"/>
+          <w:lang w:val="es-MX"/>
+        </w:rPr>
+        <w:t>Mostrar matriz de vuelos</w:t>
+      </w:r>
+    </w:p>
+    <w:p>
+      <w:pPr>
+        <w:ind w:left="360"/>
+        <w:rPr>
+          <w:b/>
+          <w:bCs/>
+          <w:sz w:val="24"/>
+          <w:szCs w:val="24"/>
+          <w:lang w:val="es-MX"/>
+        </w:rPr>
+      </w:pPr>
+      <w:r>
+        <w:rPr>
+          <w:b/>
+          <w:bCs/>
+          <w:sz w:val="24"/>
+          <w:szCs w:val="24"/>
+          <w:lang w:val="es-MX"/>
+        </w:rPr>
+        <w:drawing>
+          <wp:inline distT="0" distB="0" distL="0" distR="0" wp14:anchorId="356215C8" wp14:editId="1ED26FC9">
+            <wp:extent cx="4366260" cy="2866524"/>
+            <wp:effectExtent l="0" t="0" r="0" b="0"/>
+            <wp:docPr id="1713561127" name="Picture 1"/>
+            <wp:cNvGraphicFramePr>
+              <a:graphicFrameLocks xmlns:a="http://schemas.openxmlformats.org/drawingml/2006/main" noChangeAspect="1"/>
+            </wp:cNvGraphicFramePr>
+            <a:graphic xmlns:a="http://schemas.openxmlformats.org/drawingml/2006/main">
+              <a:graphicData uri="http://schemas.openxmlformats.org/drawingml/2006/picture">
+                <pic:pic xmlns:pic="http://schemas.openxmlformats.org/drawingml/2006/picture">
+                  <pic:nvPicPr>
+                    <pic:cNvPr id="1713561127" name=""/>
+                    <pic:cNvPicPr/>
+                  </pic:nvPicPr>
+                  <pic:blipFill>
+                    <a:blip r:embed="rId9"/>
+                    <a:stretch>
+                      <a:fillRect/>
+                    </a:stretch>
+                  </pic:blipFill>
+                  <pic:spPr>
+                    <a:xfrm>
+                      <a:off x="0" y="0"/>
+                      <a:ext cx="4387054" cy="2880176"/>
+                    </a:xfrm>
+                    <a:prstGeom prst="rect">
+                      <a:avLst/>
+                    </a:prstGeom>
+                  </pic:spPr>
+                </pic:pic>
+              </a:graphicData>
+            </a:graphic>
+          </wp:inline>
+        </w:drawing>
+      </w:r>
+    </w:p>
+    <w:p>
+      <w:pPr>
+        <w:ind w:left="360"/>
+        <w:rPr>
+          <w:sz w:val="24"/>
+          <w:szCs w:val="24"/>
+          <w:lang w:val="es-MX"/>
+        </w:rPr>
+      </w:pPr>
+      <w:r>
+        <w:rPr>
+          <w:sz w:val="24"/>
+          <w:szCs w:val="24"/>
+          <w:lang w:val="es-MX"/>
+        </w:rPr>
+        <w:t>Con esta opción podremos visualizar los tiempos (en horas) y costo de ir de un lugar a otro DIRECTAMENTE, siendo esta la equivalencia de una matriz de adyacencia del grafo que podemos representar mediante los vuelos que existen entre destinos.</w:t>
+      </w:r>
+    </w:p>
+    <w:p>
+      <w:pPr>
+        <w:rPr>
+          <w:b/>
+          <w:bCs/>
+          <w:sz w:val="24"/>
+          <w:szCs w:val="24"/>
+          <w:lang w:val="es-MX"/>
+        </w:rPr>
+      </w:pPr>
+    </w:p>
+    <w:p>
+      <w:pPr>
+        <w:rPr>
+          <w:b/>
+          <w:bCs/>
+          <w:sz w:val="24"/>
+          <w:szCs w:val="24"/>
+          <w:lang w:val="es-MX"/>
+        </w:rPr>
+      </w:pPr>
+    </w:p>
+    <w:p>
+      <w:pPr>
+        <w:rPr>
+          <w:b/>
+          <w:bCs/>
+          <w:sz w:val="24"/>
+          <w:szCs w:val="24"/>
+          <w:lang w:val="es-MX"/>
+        </w:rPr>
+      </w:pPr>
+    </w:p>
+    <w:p>
+      <w:pPr>
+        <w:rPr>
+          <w:b/>
+          <w:bCs/>
+          <w:sz w:val="24"/>
+          <w:szCs w:val="24"/>
+          <w:lang w:val="es-MX"/>
+        </w:rPr>
+      </w:pPr>
+    </w:p>
+    <w:p>
+      <w:pPr>
+        <w:pStyle w:val="ListParagraph"/>
+        <w:numPr>
+          <w:ilvl w:val="0"/>
+          <w:numId w:val="1"/>
+        </w:numPr>
+        <w:rPr>
+          <w:b/>
+          <w:bCs/>
+          <w:sz w:val="24"/>
+          <w:szCs w:val="24"/>
+          <w:lang w:val="es-MX"/>
+        </w:rPr>
+      </w:pPr>
+      <w:r>
+        <w:rPr>
+          <w:b/>
+          <w:bCs/>
+          <w:sz w:val="24"/>
+          <w:szCs w:val="24"/>
+          <w:lang w:val="es-MX"/>
+        </w:rPr>
+        <w:lastRenderedPageBreak/>
+        <w:t>Calcular rutas</w:t>
+      </w:r>
+    </w:p>
+    <w:p>
+      <w:pPr>
+        <w:rPr>
+          <w:sz w:val="24"/>
+          <w:szCs w:val="24"/>
+          <w:lang w:val="es-MX"/>
+        </w:rPr>
+      </w:pPr>
+      <w:r>
+        <w:rPr>
+          <w:b/>
+          <w:bCs/>
+          <w:sz w:val="24"/>
+          <w:szCs w:val="24"/>
+          <w:lang w:val="es-MX"/>
+        </w:rPr>
+        <w:drawing>
+          <wp:anchor distT="0" distB="0" distL="114300" distR="114300" simplePos="0" relativeHeight="251660288" behindDoc="0" locked="0" layoutInCell="1" allowOverlap="1" wp14:anchorId="7077BF7E" wp14:editId="42C4B3DE">
+            <wp:simplePos x="0" y="0"/>
+            <wp:positionH relativeFrom="column">
+              <wp:posOffset>228600</wp:posOffset>
+            </wp:positionH>
+            <wp:positionV relativeFrom="paragraph">
+              <wp:posOffset>2540</wp:posOffset>
+            </wp:positionV>
+            <wp:extent cx="1536420" cy="3246120"/>
+            <wp:effectExtent l="0" t="0" r="6985" b="0"/>
+            <wp:wrapSquare wrapText="bothSides"/>
+            <wp:docPr id="1322426071" name="Picture 1"/>
+            <wp:cNvGraphicFramePr>
+              <a:graphicFrameLocks xmlns:a="http://schemas.openxmlformats.org/drawingml/2006/main" noChangeAspect="1"/>
+            </wp:cNvGraphicFramePr>
+            <a:graphic xmlns:a="http://schemas.openxmlformats.org/drawingml/2006/main">
+              <a:graphicData uri="http://schemas.openxmlformats.org/drawingml/2006/picture">
+                <pic:pic xmlns:pic="http://schemas.openxmlformats.org/drawingml/2006/picture">
+                  <pic:nvPicPr>
+                    <pic:cNvPr id="1322426071" name=""/>
+                    <pic:cNvPicPr/>
+                  </pic:nvPicPr>
+                  <pic:blipFill>
+                    <a:blip r:embed="rId10">
+                      <a:extLst>
+                        <a:ext uri="{28A0092B-C50C-407E-A947-70E740481C1C}">
+                          <a14:useLocalDpi xmlns:a14="http://schemas.microsoft.com/office/drawing/2010/main" val="0"/>
+                        </a:ext>
+                      </a:extLst>
+                    </a:blip>
+                    <a:stretch>
+                      <a:fillRect/>
+                    </a:stretch>
+                  </pic:blipFill>
+                  <pic:spPr>
+                    <a:xfrm>
+                      <a:off x="0" y="0"/>
+                      <a:ext cx="1536420" cy="3246120"/>
+                    </a:xfrm>
+                    <a:prstGeom prst="rect">
+                      <a:avLst/>
+                    </a:prstGeom>
+                  </pic:spPr>
+                </pic:pic>
+              </a:graphicData>
+            </a:graphic>
+          </wp:anchor>
+        </w:drawing>
+      </w:r>
+      <w:r>
+        <w:rPr>
+          <w:sz w:val="24"/>
+          <w:szCs w:val="24"/>
+          <w:lang w:val="es-MX"/>
+        </w:rPr>
+        <w:t xml:space="preserve">En esta opción se pueden calcula las diferentes rutas que existen entre dos destinos. Solamente requerimos </w:t>
+      </w:r>
+      <w:r>
+        <w:rPr>
+          <w:sz w:val="24"/>
+          <w:szCs w:val="24"/>
+          <w:lang w:val="es-MX"/>
+        </w:rPr>
+        <w:t>que</w:t>
+      </w:r>
+      <w:r>
+        <w:rPr>
+          <w:sz w:val="24"/>
+          <w:szCs w:val="24"/>
+          <w:lang w:val="es-MX"/>
+        </w:rPr>
+        <w:t xml:space="preserve"> se ingrese cual es el origen y </w:t>
+      </w:r>
+      <w:r>
+        <w:rPr>
+          <w:sz w:val="24"/>
+          <w:szCs w:val="24"/>
+          <w:lang w:val="es-MX"/>
+        </w:rPr>
+        <w:t>cuál</w:t>
+      </w:r>
+      <w:r>
+        <w:rPr>
+          <w:sz w:val="24"/>
+          <w:szCs w:val="24"/>
+          <w:lang w:val="es-MX"/>
+        </w:rPr>
+        <w:t xml:space="preserve"> es el destino.</w:t>
+      </w:r>
+    </w:p>
+    <w:p>
+      <w:pPr>
+        <w:rPr>
+          <w:sz w:val="24"/>
+          <w:szCs w:val="24"/>
+          <w:lang w:val="es-MX"/>
+        </w:rPr>
+      </w:pPr>
+    </w:p>
+    <w:p>
+      <w:pPr>
+        <w:rPr>
+          <w:sz w:val="24"/>
+          <w:szCs w:val="24"/>
+          <w:lang w:val="es-MX"/>
+        </w:rPr>
+      </w:pPr>
+    </w:p>
+    <w:p>
+      <w:pPr>
+        <w:rPr>
+          <w:sz w:val="24"/>
+          <w:szCs w:val="24"/>
+          <w:lang w:val="es-MX"/>
+        </w:rPr>
+      </w:pPr>
+    </w:p>
+    <w:p>
+      <w:pPr>
+        <w:rPr>
+          <w:sz w:val="24"/>
+          <w:szCs w:val="24"/>
+          <w:lang w:val="es-MX"/>
+        </w:rPr>
+      </w:pPr>
+    </w:p>
+    <w:p>
+      <w:pPr>
+        <w:rPr>
+          <w:sz w:val="24"/>
+          <w:szCs w:val="24"/>
+          <w:lang w:val="es-MX"/>
+        </w:rPr>
+      </w:pPr>
+    </w:p>
+    <w:p>
+      <w:pPr>
+        <w:rPr>
+          <w:sz w:val="24"/>
+          <w:szCs w:val="24"/>
+          <w:lang w:val="es-MX"/>
+        </w:rPr>
+      </w:pPr>
+    </w:p>
+    <w:p>
+      <w:pPr>
+        <w:rPr>
+          <w:sz w:val="24"/>
+          <w:szCs w:val="24"/>
+          <w:lang w:val="es-MX"/>
+        </w:rPr>
+      </w:pPr>
+    </w:p>
+    <w:p>
+      <w:pPr>
+        <w:rPr>
+          <w:sz w:val="24"/>
+          <w:szCs w:val="24"/>
+          <w:lang w:val="es-MX"/>
+        </w:rPr>
+      </w:pPr>
+    </w:p>
+    <w:p>
+      <w:pPr>
+        <w:rPr>
+          <w:sz w:val="24"/>
+          <w:szCs w:val="24"/>
+          <w:lang w:val="es-MX"/>
+        </w:rPr>
+      </w:pPr>
+    </w:p>
+    <w:p>
+      <w:pPr>
+        <w:ind w:left="360"/>
+        <w:rPr>
+          <w:sz w:val="24"/>
+          <w:szCs w:val="24"/>
+          <w:lang w:val="es-MX"/>
+        </w:rPr>
+      </w:pPr>
+      <w:r>
+        <w:rPr>
+          <w:sz w:val="24"/>
+          <w:szCs w:val="24"/>
+          <w:lang w:val="es-MX"/>
+        </w:rPr>
+        <w:t>Una vez ingresada esta información, el programa nos arrojara un listado de las diferentes rutas que existen.</w:t>
+      </w:r>
+    </w:p>
+    <w:p>
+      <w:pPr>
+        <w:ind w:firstLine="360"/>
+        <w:rPr>
+          <w:sz w:val="24"/>
+          <w:szCs w:val="24"/>
+          <w:lang w:val="es-MX"/>
+        </w:rPr>
+      </w:pPr>
+      <w:r>
+        <w:rPr>
+          <w:sz w:val="24"/>
+          <w:szCs w:val="24"/>
+          <w:lang w:val="es-MX"/>
+        </w:rPr>
+        <w:drawing>
+          <wp:inline distT="0" distB="0" distL="0" distR="0" wp14:anchorId="37235BD4" wp14:editId="7F2731A4">
+            <wp:extent cx="5303520" cy="1904961"/>
+            <wp:effectExtent l="0" t="0" r="0" b="635"/>
+            <wp:docPr id="146653512" name="Picture 1"/>
+            <wp:cNvGraphicFramePr>
+              <a:graphicFrameLocks xmlns:a="http://schemas.openxmlformats.org/drawingml/2006/main" noChangeAspect="1"/>
+            </wp:cNvGraphicFramePr>
+            <a:graphic xmlns:a="http://schemas.openxmlformats.org/drawingml/2006/main">
+              <a:graphicData uri="http://schemas.openxmlformats.org/drawingml/2006/picture">
+                <pic:pic xmlns:pic="http://schemas.openxmlformats.org/drawingml/2006/picture">
+                  <pic:nvPicPr>
+                    <pic:cNvPr id="146653512" name=""/>
+                    <pic:cNvPicPr/>
+                  </pic:nvPicPr>
+                  <pic:blipFill>
+                    <a:blip r:embed="rId11"/>
+                    <a:stretch>
+                      <a:fillRect/>
+                    </a:stretch>
+                  </pic:blipFill>
+                  <pic:spPr>
+                    <a:xfrm>
+                      <a:off x="0" y="0"/>
+                      <a:ext cx="5364755" cy="1926956"/>
+                    </a:xfrm>
+                    <a:prstGeom prst="rect">
+                      <a:avLst/>
+                    </a:prstGeom>
+                  </pic:spPr>
+                </pic:pic>
+              </a:graphicData>
+            </a:graphic>
+          </wp:inline>
+        </w:drawing>
+      </w:r>
+    </w:p>
+    <w:p>
+      <w:pPr>
+        <w:ind w:left="360"/>
+        <w:rPr>
+          <w:sz w:val="24"/>
+          <w:szCs w:val="24"/>
+          <w:lang w:val="es-MX"/>
+        </w:rPr>
+      </w:pPr>
+      <w:r>
+        <w:rPr>
+          <w:sz w:val="24"/>
+          <w:szCs w:val="24"/>
+          <w:lang w:val="es-MX"/>
+        </w:rPr>
+        <w:t>Posteriormente podremos escoger si del listado queremos obtener ya sea, únicamente la de menor costo o la de menor tiempo.</w:t>
+      </w:r>
+    </w:p>
+    <w:p>
+      <w:pPr>
+        <w:ind w:firstLine="360"/>
+        <w:rPr>
+          <w:sz w:val="24"/>
+          <w:szCs w:val="24"/>
+          <w:lang w:val="es-MX"/>
+        </w:rPr>
+      </w:pPr>
+      <w:r>
+        <w:rPr>
+          <w:sz w:val="24"/>
+          <w:szCs w:val="24"/>
+          <w:lang w:val="es-MX"/>
+        </w:rPr>
+        <w:drawing>
+          <wp:inline distT="0" distB="0" distL="0" distR="0" wp14:anchorId="2400ED3A" wp14:editId="7DA6F0B1">
+            <wp:extent cx="2613660" cy="893369"/>
+            <wp:effectExtent l="0" t="0" r="0" b="2540"/>
+            <wp:docPr id="1733989664" name="Picture 1"/>
+            <wp:cNvGraphicFramePr>
+              <a:graphicFrameLocks xmlns:a="http://schemas.openxmlformats.org/drawingml/2006/main" noChangeAspect="1"/>
+            </wp:cNvGraphicFramePr>
+            <a:graphic xmlns:a="http://schemas.openxmlformats.org/drawingml/2006/main">
+              <a:graphicData uri="http://schemas.openxmlformats.org/drawingml/2006/picture">
+                <pic:pic xmlns:pic="http://schemas.openxmlformats.org/drawingml/2006/picture">
+                  <pic:nvPicPr>
+                    <pic:cNvPr id="1733989664" name=""/>
+                    <pic:cNvPicPr/>
+                  </pic:nvPicPr>
+                  <pic:blipFill>
+                    <a:blip r:embed="rId12"/>
+                    <a:stretch>
+                      <a:fillRect/>
+                    </a:stretch>
+                  </pic:blipFill>
+                  <pic:spPr>
+                    <a:xfrm>
+                      <a:off x="0" y="0"/>
+                      <a:ext cx="2640912" cy="902684"/>
+                    </a:xfrm>
+                    <a:prstGeom prst="rect">
+                      <a:avLst/>
+                    </a:prstGeom>
+                  </pic:spPr>
+                </pic:pic>
+              </a:graphicData>
+            </a:graphic>
+          </wp:inline>
+        </w:drawing>
+      </w:r>
+      <w:r>
+        <w:rPr>
+          <w:sz w:val="24"/>
+          <w:szCs w:val="24"/>
+          <w:lang w:val="es-MX"/>
+        </w:rPr>
+        <w:t xml:space="preserve">  </w:t>
+      </w:r>
+      <w:r>
+        <w:rPr>
+          <w:sz w:val="24"/>
+          <w:szCs w:val="24"/>
+          <w:lang w:val="es-MX"/>
+        </w:rPr>
+        <w:drawing>
+          <wp:inline distT="0" distB="0" distL="0" distR="0" wp14:anchorId="6D6057A0" wp14:editId="13AE5EA9">
+            <wp:extent cx="2339340" cy="912573"/>
+            <wp:effectExtent l="0" t="0" r="3810" b="1905"/>
+            <wp:docPr id="2036829555" name="Picture 1"/>
+            <wp:cNvGraphicFramePr>
+              <a:graphicFrameLocks xmlns:a="http://schemas.openxmlformats.org/drawingml/2006/main" noChangeAspect="1"/>
+            </wp:cNvGraphicFramePr>
+            <a:graphic xmlns:a="http://schemas.openxmlformats.org/drawingml/2006/main">
+              <a:graphicData uri="http://schemas.openxmlformats.org/drawingml/2006/picture">
+                <pic:pic xmlns:pic="http://schemas.openxmlformats.org/drawingml/2006/picture">
+                  <pic:nvPicPr>
+                    <pic:cNvPr id="2036829555" name=""/>
+                    <pic:cNvPicPr/>
+                  </pic:nvPicPr>
+                  <pic:blipFill>
+                    <a:blip r:embed="rId13"/>
+                    <a:stretch>
+                      <a:fillRect/>
+                    </a:stretch>
+                  </pic:blipFill>
+                  <pic:spPr>
+                    <a:xfrm>
+                      <a:off x="0" y="0"/>
+                      <a:ext cx="2359057" cy="920265"/>
+                    </a:xfrm>
+                    <a:prstGeom prst="rect">
+                      <a:avLst/>
+                    </a:prstGeom>
+                  </pic:spPr>
+                </pic:pic>
+              </a:graphicData>
+            </a:graphic>
+          </wp:inline>
+        </w:drawing>
+      </w:r>
+    </w:p>
+    <w:p>
+      <w:pPr>
+        <w:rPr>
+          <w:sz w:val="24"/>
+          <w:szCs w:val="24"/>
+          <w:lang w:val="es-MX"/>
+        </w:rPr>
+      </w:pPr>
+    </w:p>
+    <w:p>
+      <w:pPr>
+        <w:pStyle w:val="ListParagraph"/>
+        <w:numPr>
+          <w:ilvl w:val="0"/>
+          <w:numId w:val="1"/>
+        </w:numPr>
+        <w:rPr>
+          <w:b/>
+          <w:bCs/>
+          <w:sz w:val="24"/>
+          <w:szCs w:val="24"/>
+          <w:lang w:val="es-MX"/>
+        </w:rPr>
+      </w:pPr>
+      <w:r>
+        <w:rPr>
+          <w:b/>
+          <w:bCs/>
+          <w:sz w:val="24"/>
+          <w:szCs w:val="24"/>
+          <w:lang w:val="es-MX"/>
+        </w:rPr>
+        <w:lastRenderedPageBreak/>
+        <w:t>Salir</w:t>
+      </w:r>
+    </w:p>
+    <w:p>
+      <w:pPr>
+        <w:pStyle w:val="ListParagraph"/>
+        <w:ind w:left="360"/>
+        <w:rPr>
+          <w:sz w:val="24"/>
+          <w:szCs w:val="24"/>
+          <w:lang w:val="es-MX"/>
+        </w:rPr>
+      </w:pPr>
+      <w:r>
+        <w:rPr>
+          <w:sz w:val="24"/>
+          <w:szCs w:val="24"/>
+          <w:lang w:val="es-MX"/>
+        </w:rPr>
+        <w:t xml:space="preserve">Esta opción, aunque sencilla de entender, es importante utilizarla y no salir del programa mediante hacer </w:t>
+      </w:r>
+      <w:r>
+        <w:rPr>
+          <w:sz w:val="24"/>
+          <w:szCs w:val="24"/>
+          <w:lang w:val="es-MX"/>
+        </w:rPr>
+        <w:t>clic</w:t>
+      </w:r>
+      <w:r>
+        <w:rPr>
+          <w:sz w:val="24"/>
+          <w:szCs w:val="24"/>
+          <w:lang w:val="es-MX"/>
+        </w:rPr>
+        <w:t xml:space="preserve"> en la ventana de la consola, </w:t>
+      </w:r>
+      <w:r>
+        <w:rPr>
+          <w:sz w:val="24"/>
+          <w:szCs w:val="24"/>
+          <w:lang w:val="es-MX"/>
+        </w:rPr>
+        <w:t>ya que,</w:t>
+      </w:r>
+      <w:r>
+        <w:rPr>
+          <w:sz w:val="24"/>
+          <w:szCs w:val="24"/>
+          <w:lang w:val="es-MX"/>
+        </w:rPr>
+        <w:t xml:space="preserve"> de esta manera, no se estaría guardando ni limpiando la memoria que ha utilizado el programa, que, aunque tiene un impacto mínimo, es buena costumbre utilizar el método de salida adecuado.</w:t>
+      </w:r>
+    </w:p>
+    <w:p>
+      <w:pPr>
+        <w:pStyle w:val="ListParagraph"/>
+        <w:ind w:left="360"/>
+        <w:rPr>
+          <w:sz w:val="24"/>
+          <w:szCs w:val="24"/>
+          <w:lang w:val="es-MX"/>
+        </w:rPr>
+      </w:pPr>
+    </w:p>
+    <w:p>
+      <w:pPr>
+        <w:tabs>
+          <w:tab w:val="left" w:pos="360"/>
+        </w:tabs>
+        <w:rPr>
+          <w:b/>
+          <w:bCs/>
+          <w:sz w:val="28"/>
+          <w:szCs w:val="28"/>
+          <w:lang w:val="es-MX"/>
+        </w:rPr>
+      </w:pPr>
+      <w:r>
+        <w:rPr>
+          <w:b/>
+          <w:bCs/>
+          <w:sz w:val="28"/>
+          <w:szCs w:val="28"/>
+          <w:lang w:val="es-MX"/>
+        </w:rPr>
+        <w:t>Métodos</w:t>
+      </w:r>
+      <w:r>
+        <w:rPr>
+          <w:b/>
+          <w:bCs/>
+          <w:sz w:val="28"/>
+          <w:szCs w:val="28"/>
+          <w:lang w:val="es-MX"/>
+        </w:rPr>
+        <w:t xml:space="preserve"> de contacto</w:t>
+      </w:r>
+    </w:p>
+    <w:p>
+      <w:pPr>
+        <w:tabs>
+          <w:tab w:val="left" w:pos="360"/>
+        </w:tabs>
+        <w:ind w:left="360"/>
+        <w:rPr>
+          <w:b/>
+          <w:bCs/>
+          <w:sz w:val="24"/>
+          <w:szCs w:val="24"/>
+          <w:lang w:val="es-MX"/>
+        </w:rPr>
+      </w:pPr>
+      <w:hyperlink r:id="rId14" w:history="1">
+        <w:r>
+          <w:rPr>
+            <w:rStyle w:val="Hyperlink"/>
+            <w:b/>
+            <w:bCs/>
+            <w:sz w:val="24"/>
+            <w:szCs w:val="24"/>
+            <w:lang w:val="es-MX"/>
+          </w:rPr>
+          <w:t>cesar.alonsor@uanl.edu.mx</w:t>
+        </w:r>
+      </w:hyperlink>
+    </w:p>
+    <w:p>
+      <w:pPr>
+        <w:tabs>
+          <w:tab w:val="left" w:pos="360"/>
+        </w:tabs>
+        <w:ind w:left="360"/>
+        <w:rPr>
+          <w:b/>
+          <w:bCs/>
+          <w:sz w:val="24"/>
+          <w:szCs w:val="24"/>
+          <w:lang w:val="es-MX"/>
+        </w:rPr>
+      </w:pPr>
+      <w:hyperlink r:id="rId15" w:history="1">
+        <w:r>
+          <w:rPr>
+            <w:rStyle w:val="Hyperlink"/>
+            <w:b/>
+            <w:bCs/>
+            <w:sz w:val="24"/>
+            <w:szCs w:val="24"/>
+            <w:lang w:val="es-MX"/>
+          </w:rPr>
+          <w:t>sebastian.calderonc@uanl.edu.mx</w:t>
+        </w:r>
+      </w:hyperlink>
+    </w:p>
+    <w:p>
+      <w:pPr>
+        <w:tabs>
+          <w:tab w:val="left" w:pos="360"/>
+        </w:tabs>
+        <w:ind w:left="360"/>
+        <w:rPr>
+          <w:b/>
+          <w:bCs/>
+          <w:sz w:val="24"/>
+          <w:szCs w:val="24"/>
+          <w:lang w:val="es-MX"/>
+        </w:rPr>
+      </w:pPr>
+      <w:hyperlink r:id="rId16" w:history="1">
+        <w:r>
+          <w:rPr>
+            <w:rStyle w:val="Hyperlink"/>
+            <w:b/>
+            <w:bCs/>
+            <w:sz w:val="24"/>
+            <w:szCs w:val="24"/>
+            <w:lang w:val="es-MX"/>
+          </w:rPr>
+          <w:t>santiago.castror@uanl.edu.mx</w:t>
+        </w:r>
+      </w:hyperlink>
+    </w:p>
+    <w:p>
+      <w:pPr>
+        <w:tabs>
+          <w:tab w:val="left" w:pos="360"/>
+        </w:tabs>
+        <w:ind w:left="360"/>
+        <w:rPr>
+          <w:b/>
+          <w:bCs/>
+          <w:sz w:val="24"/>
+          <w:szCs w:val="24"/>
+          <w:lang w:val="es-MX"/>
+        </w:rPr>
+      </w:pPr>
+      <w:hyperlink r:id="rId17" w:history="1">
+        <w:r>
+          <w:rPr>
+            <w:rStyle w:val="Hyperlink"/>
+            <w:b/>
+            <w:bCs/>
+            <w:sz w:val="24"/>
+            <w:szCs w:val="24"/>
+            <w:lang w:val="es-MX"/>
+          </w:rPr>
+          <w:t>edson.amayam@uanl.edu.mx</w:t>
+        </w:r>
+      </w:hyperlink>
+    </w:p>
+    <w:p>
+      <w:pPr>
+        <w:tabs>
+          <w:tab w:val="left" w:pos="360"/>
+        </w:tabs>
+        <w:rPr>
+          <w:b/>
+          <w:bCs/>
+          <w:sz w:val="24"/>
+          <w:szCs w:val="24"/>
+          <w:lang w:val="es-MX"/>
+        </w:rPr>
+      </w:pPr>
     </w:p>
     <w:sectPr>
       <w:pgSz w:w="12240" w:h="15840"/>
@@ -479,6 +1911,103 @@
     </w:sectPr>
   </w:body>
 </w:document>
+</file>
+
+<file path=word/numbering.xml><?xml version="1.0" encoding="utf-8"?>
+<w:numbering xmlns:wpc="http://schemas.microsoft.com/office/word/2010/wordprocessingCanvas" xmlns:cx="http://schemas.microsoft.com/office/drawing/2014/chartex" xmlns:cx1="http://schemas.microsoft.com/office/drawing/2015/9/8/chartex" xmlns:cx2="http://schemas.microsoft.com/office/drawing/2015/10/21/chartex" xmlns:cx3="http://schemas.microsoft.com/office/drawing/2016/5/9/chartex" xmlns:cx4="http://schemas.microsoft.com/office/drawing/2016/5/10/chartex" xmlns:cx5="http://schemas.microsoft.com/office/drawing/2016/5/11/chartex" xmlns:cx6="http://schemas.microsoft.com/office/drawing/2016/5/12/chartex" xmlns:cx7="http://schemas.microsoft.com/office/drawing/2016/5/13/chartex" xmlns:cx8="http://schemas.microsoft.com/office/drawing/2016/5/14/chartex" xmlns:mc="http://schemas.openxmlformats.org/markup-compatibility/2006" xmlns:aink="http://schemas.microsoft.com/office/drawing/2016/ink" xmlns:am3d="http://schemas.microsoft.com/office/drawing/2017/model3d" xmlns:o="urn:schemas-microsoft-com:office:office" xmlns:oel="http://schemas.microsoft.com/office/2019/extlst" xmlns:r="http://schemas.openxmlformats.org/officeDocument/2006/relationships" xmlns:m="http://schemas.openxmlformats.org/officeDocument/2006/math" xmlns:v="urn:schemas-microsoft-com:vml" xmlns:wp14="http://schemas.microsoft.com/office/word/2010/wordprocessingDrawing" xmlns:wp="http://schemas.openxmlformats.org/drawingml/2006/wordprocessingDrawing" xmlns:w10="urn:schemas-microsoft-com:office:word" xmlns:w="http://schemas.openxmlformats.org/wordprocessingml/2006/main" xmlns:w14="http://schemas.microsoft.com/office/word/2010/wordml" xmlns:w15="http://schemas.microsoft.com/office/word/2012/wordml" xmlns:w16cex="http://schemas.microsoft.com/office/word/2018/wordml/cex" xmlns:w16cid="http://schemas.microsoft.com/office/word/2016/wordml/cid" xmlns:w16="http://schemas.microsoft.com/office/word/2018/wordml" xmlns:w16du="http://schemas.microsoft.com/office/word/2023/wordml/word16du" xmlns:w16sdtdh="http://schemas.microsoft.com/office/word/2020/wordml/sdtdatahash" xmlns:w16sdtfl="http://schemas.microsoft.com/office/word/2024/wordml/sdtformatlock" xmlns:w16se="http://schemas.microsoft.com/office/word/2015/wordml/symex" xmlns:wpg="http://schemas.microsoft.com/office/word/2010/wordprocessingGroup" xmlns:wpi="http://schemas.microsoft.com/office/word/2010/wordprocessingInk" xmlns:wne="http://schemas.microsoft.com/office/word/2006/wordml" xmlns:wps="http://schemas.microsoft.com/office/word/2010/wordprocessingShape" mc:Ignorable="w14 w15 w16se w16cid w16 w16cex w16sdtdh w16sdtfl w16du wp14">
+  <w:abstractNum w:abstractNumId="0" w15:restartNumberingAfterBreak="0">
+    <w:nsid w:val="74646F71"/>
+    <w:multiLevelType w:val="hybridMultilevel"/>
+    <w:tmpl w:val="372AC628"/>
+    <w:lvl w:ilvl="0" w:tplc="0409000F">
+      <w:start w:val="1"/>
+      <w:numFmt w:val="decimal"/>
+      <w:lvlText w:val="%1."/>
+      <w:lvlJc w:val="left"/>
+      <w:pPr>
+        <w:ind w:left="360" w:hanging="360"/>
+      </w:pPr>
+      <w:rPr>
+        <w:rFonts w:hint="default"/>
+      </w:rPr>
+    </w:lvl>
+    <w:lvl w:ilvl="1" w:tplc="04090019" w:tentative="1">
+      <w:start w:val="1"/>
+      <w:numFmt w:val="lowerLetter"/>
+      <w:lvlText w:val="%2."/>
+      <w:lvlJc w:val="left"/>
+      <w:pPr>
+        <w:ind w:left="1080" w:hanging="360"/>
+      </w:pPr>
+    </w:lvl>
+    <w:lvl w:ilvl="2" w:tplc="0409001B" w:tentative="1">
+      <w:start w:val="1"/>
+      <w:numFmt w:val="lowerRoman"/>
+      <w:lvlText w:val="%3."/>
+      <w:lvlJc w:val="right"/>
+      <w:pPr>
+        <w:ind w:left="1800" w:hanging="180"/>
+      </w:pPr>
+    </w:lvl>
+    <w:lvl w:ilvl="3" w:tplc="0409000F" w:tentative="1">
+      <w:start w:val="1"/>
+      <w:numFmt w:val="decimal"/>
+      <w:lvlText w:val="%4."/>
+      <w:lvlJc w:val="left"/>
+      <w:pPr>
+        <w:ind w:left="2520" w:hanging="360"/>
+      </w:pPr>
+    </w:lvl>
+    <w:lvl w:ilvl="4" w:tplc="04090019" w:tentative="1">
+      <w:start w:val="1"/>
+      <w:numFmt w:val="lowerLetter"/>
+      <w:lvlText w:val="%5."/>
+      <w:lvlJc w:val="left"/>
+      <w:pPr>
+        <w:ind w:left="3240" w:hanging="360"/>
+      </w:pPr>
+    </w:lvl>
+    <w:lvl w:ilvl="5" w:tplc="0409001B" w:tentative="1">
+      <w:start w:val="1"/>
+      <w:numFmt w:val="lowerRoman"/>
+      <w:lvlText w:val="%6."/>
+      <w:lvlJc w:val="right"/>
+      <w:pPr>
+        <w:ind w:left="3960" w:hanging="180"/>
+      </w:pPr>
+    </w:lvl>
+    <w:lvl w:ilvl="6" w:tplc="0409000F" w:tentative="1">
+      <w:start w:val="1"/>
+      <w:numFmt w:val="decimal"/>
+      <w:lvlText w:val="%7."/>
+      <w:lvlJc w:val="left"/>
+      <w:pPr>
+        <w:ind w:left="4680" w:hanging="360"/>
+      </w:pPr>
+    </w:lvl>
+    <w:lvl w:ilvl="7" w:tplc="04090019" w:tentative="1">
+      <w:start w:val="1"/>
+      <w:numFmt w:val="lowerLetter"/>
+      <w:lvlText w:val="%8."/>
+      <w:lvlJc w:val="left"/>
+      <w:pPr>
+        <w:ind w:left="5400" w:hanging="360"/>
+      </w:pPr>
+    </w:lvl>
+    <w:lvl w:ilvl="8" w:tplc="0409001B" w:tentative="1">
+      <w:start w:val="1"/>
+      <w:numFmt w:val="lowerRoman"/>
+      <w:lvlText w:val="%9."/>
+      <w:lvlJc w:val="right"/>
+      <w:pPr>
+        <w:ind w:left="6120" w:hanging="180"/>
+      </w:pPr>
+    </w:lvl>
+  </w:abstractNum>
+  <w:num w:numId="1" w16cid:durableId="1521046667">
+    <w:abstractNumId w:val="0"/>
+  </w:num>
+</w:numbering>
 </file>
 
 <file path=word/styles.xml><?xml version="1.0" encoding="utf-8"?>
@@ -885,6 +2414,7 @@
   <w:style w:type="character" w:default="1" w:styleId="DefaultParagraphFont">
     <w:name w:val="Default Paragraph Font"/>
     <w:uiPriority w:val="1"/>
+    <w:semiHidden/>
     <w:unhideWhenUsed/>
   </w:style>
   <w:style w:type="table" w:default="1" w:styleId="TableNormal">
@@ -930,6 +2460,17 @@
       <w:color w:val="605E5C"/>
       <w:shd w:val="clear" w:color="auto" w:fill="E1DFDD"/>
     </w:rPr>
+  </w:style>
+  <w:style w:type="paragraph" w:styleId="ListParagraph">
+    <w:name w:val="List Paragraph"/>
+    <w:basedOn w:val="Normal"/>
+    <w:uiPriority w:val="34"/>
+    <w:qFormat/>
+    <w:rsid w:val="00653CEA"/>
+    <w:pPr>
+      <w:ind w:left="720"/>
+      <w:contextualSpacing/>
+    </w:pPr>
   </w:style>
 </w:styles>
 </file>

</xml_diff>

<commit_message>
fix manual de usuario
</commit_message>
<xml_diff>
--- a/Manual de Usuario.docx
+++ b/Manual de Usuario.docx
@@ -468,6 +468,7 @@
         <w:rPr>
           <w:b/>
           <w:bCs/>
+          <w:noProof/>
           <w:sz w:val="28"/>
           <w:szCs w:val="28"/>
           <w:lang w:val="es-MX"/>
@@ -650,31 +651,7 @@
           <w:szCs w:val="24"/>
           <w:lang w:val="es-MX"/>
         </w:rPr>
-        <w:t>Tiempo_destino</w:t>
-      </w:r>
-      <w:r>
-        <w:rPr>
-          <w:sz w:val="24"/>
-          <w:szCs w:val="24"/>
-          <w:lang w:val="es-MX"/>
-        </w:rPr>
-        <w:t>2,</w:t>
-      </w:r>
-      <w:r>
-        <w:rPr>
-          <w:sz w:val="24"/>
-          <w:szCs w:val="24"/>
-          <w:lang w:val="es-MX"/>
-        </w:rPr>
-        <w:t xml:space="preserve"> Costo_destino</w:t>
-      </w:r>
-      <w:r>
-        <w:rPr>
-          <w:sz w:val="24"/>
-          <w:szCs w:val="24"/>
-          <w:lang w:val="es-MX"/>
-        </w:rPr>
-        <w:t>2</w:t>
+        <w:t>Tiempo_destino2, Costo_destino2</w:t>
       </w:r>
     </w:p>
     <w:p>
@@ -823,7 +800,23 @@
           <w:szCs w:val="24"/>
           <w:lang w:val="es-MX"/>
         </w:rPr>
-        <w:t xml:space="preserve">solamente habrá que abrir el archivo llamado programa.exe ubicado en la carpeta bin. </w:t>
+        <w:t xml:space="preserve">solamente habrá que </w:t>
+      </w:r>
+      <w:r>
+        <w:rPr>
+          <w:sz w:val="24"/>
+          <w:szCs w:val="24"/>
+          <w:lang w:val="es-MX"/>
+        </w:rPr>
+        <w:t>ejecutar el archivo NexByte.bat ubicado en el directorio principal del software</w:t>
+      </w:r>
+      <w:r>
+        <w:rPr>
+          <w:sz w:val="24"/>
+          <w:szCs w:val="24"/>
+          <w:lang w:val="es-MX"/>
+        </w:rPr>
+        <w:t xml:space="preserve">. </w:t>
       </w:r>
     </w:p>
     <w:p>
@@ -955,6 +948,7 @@
         <w:rPr>
           <w:b/>
           <w:bCs/>
+          <w:noProof/>
           <w:sz w:val="24"/>
           <w:szCs w:val="24"/>
           <w:lang w:val="es-MX"/>
@@ -1131,6 +1125,7 @@
         <w:rPr>
           <w:b/>
           <w:bCs/>
+          <w:noProof/>
           <w:sz w:val="24"/>
           <w:szCs w:val="24"/>
           <w:lang w:val="es-MX"/>
@@ -1273,6 +1268,7 @@
         <w:rPr>
           <w:b/>
           <w:bCs/>
+          <w:noProof/>
           <w:sz w:val="24"/>
           <w:szCs w:val="24"/>
           <w:lang w:val="es-MX"/>
@@ -1478,6 +1474,7 @@
       </w:pPr>
       <w:r>
         <w:rPr>
+          <w:noProof/>
           <w:sz w:val="24"/>
           <w:szCs w:val="24"/>
           <w:lang w:val="es-MX"/>
@@ -1548,6 +1545,7 @@
       </w:pPr>
       <w:r>
         <w:rPr>
+          <w:noProof/>
           <w:sz w:val="24"/>
           <w:szCs w:val="24"/>
           <w:lang w:val="es-MX"/>
@@ -1598,6 +1596,7 @@
       </w:r>
       <w:r>
         <w:rPr>
+          <w:noProof/>
           <w:sz w:val="24"/>
           <w:szCs w:val="24"/>
           <w:lang w:val="es-MX"/>

</xml_diff>